<commit_message>
docs: update instructions with new multiselect and ingredients section headers features
</commit_message>
<xml_diff>
--- a/Instrukcja_Przepisnika.docx
+++ b/Instrukcja_Przepisnika.docx
@@ -101,7 +101,31 @@
         <w:rPr>
           <w:b/>
         </w:rPr>
-        <w:t>Krok 2: Wgrywanie zdjęć</w:t>
+        <w:t>Krok 2: Filtry w przepisie (Diety, Szybkość, Pora roku)</w:t>
+        <w:br/>
+      </w:r>
+      <w:r>
+        <w:t>W formularzu tworzenia i edycji przepisu znajdziesz trzy rozwijane listy wielokrotnego wyboru. Są one generowane dynamicznie na podstawie filtrów skonfigurowanych w panelu bocznym. Możesz zaznaczyć dowolną liczbę filtrów, które wyświetlą się jako estetyczne etykiety bezpośrednio nad składnikami w przepisie.</w:t>
+        <w:br/>
+        <w:br/>
+      </w:r>
+      <w:r>
+        <w:rPr>
+          <w:b/>
+        </w:rPr>
+        <w:t>Krok 3: Sekcje w składnikach (z użyciem gwiazdki *)</w:t>
+        <w:br/>
+      </w:r>
+      <w:r>
+        <w:t>Podczas wpisywania składników możesz stworzyć nagłówki sekcji (np. na ciasto i na lukier). Aby to zrobić, wpisz linijkę zaczynającą się od znaku gwiazdki '*', np. '* Ciasto' lub '* Lukier'. W trybie gotowania te linijki pojawią się jako pogrubione, czerwone nagłówki bez pól wyboru.</w:t>
+        <w:br/>
+        <w:br/>
+      </w:r>
+      <w:r>
+        <w:rPr>
+          <w:b/>
+        </w:rPr>
+        <w:t>Krok 4: Wgrywanie zdjęć</w:t>
         <w:br/>
       </w:r>
       <w:r>
@@ -113,7 +137,7 @@
         <w:rPr>
           <w:b/>
         </w:rPr>
-        <w:t>Krok 3: Publikacja w sieci</w:t>
+        <w:t>Krok 5: Publikacja w sieci</w:t>
         <w:br/>
       </w:r>
       <w:r>

</xml_diff>